<commit_message>
Use real live-server response in handover document example
</commit_message>
<xml_diff>
--- a/Project_Handover_Document.docx
+++ b/Project_Handover_Document.docx
@@ -1186,7 +1186,7 @@
           <w:i w:val="0"/>
           <w:sz w:val="22"/>
         </w:rPr>
-        <w:t>Response</w:t>
+        <w:t>Response (actual output from the live server)</w:t>
       </w:r>
     </w:p>
     <w:p>
@@ -1199,13 +1199,23 @@
         <w:br/>
         <w:t xml:space="preserve">  "student_id": "STU-1001",</w:t>
         <w:br/>
-        <w:t xml:space="preserve">  "risk_score": 0.71,</w:t>
+        <w:t xml:space="preserve">  "risk_score": 0.623,</w:t>
         <w:br/>
         <w:t xml:space="preserve">  "risk_level": "high",</w:t>
         <w:br/>
         <w:t xml:space="preserve">  "may_fail": true,</w:t>
         <w:br/>
-        <w:t xml:space="preserve">  "alerts": [ { "type": "low_attendance", "severity": "high", ... } ]</w:t>
+        <w:t xml:space="preserve">  "alerts": [</w:t>
+        <w:br/>
+        <w:t xml:space="preserve">    { "type": "may_fail", "severity": "high",</w:t>
+        <w:br/>
+        <w:t xml:space="preserve">      "message": "High academic risk (score 0.62). Student may fail." },</w:t>
+        <w:br/>
+        <w:t xml:space="preserve">    { "type": "low_attendance", "severity": "high",</w:t>
+        <w:br/>
+        <w:t xml:space="preserve">      "message": "Attendance is 45%, below the required 75%." }</w:t>
+        <w:br/>
+        <w:t xml:space="preserve">  ]</w:t>
         <w:br/>
         <w:t>}</w:t>
       </w:r>

</xml_diff>

<commit_message>
Enable CORS for frontend access; finalize clean handover document
</commit_message>
<xml_diff>
--- a/Project_Handover_Document.docx
+++ b/Project_Handover_Document.docx
@@ -2,40 +2,42 @@
 <file path=word/document.xml><?xml version="1.0" encoding="utf-8"?>
 <w:document xmlns:wpc="http://schemas.microsoft.com/office/word/2010/wordprocessingCanvas" xmlns:mo="http://schemas.microsoft.com/office/mac/office/2008/main" xmlns:mc="http://schemas.openxmlformats.org/markup-compatibility/2006" xmlns:mv="urn:schemas-microsoft-com:mac:vml" xmlns:o="urn:schemas-microsoft-com:office:office" xmlns:r="http://schemas.openxmlformats.org/officeDocument/2006/relationships" xmlns:m="http://schemas.openxmlformats.org/officeDocument/2006/math" xmlns:v="urn:schemas-microsoft-com:vml" xmlns:wp14="http://schemas.microsoft.com/office/word/2010/wordprocessingDrawing" xmlns:wp="http://schemas.openxmlformats.org/drawingml/2006/wordprocessingDrawing" xmlns:w10="urn:schemas-microsoft-com:office:word" xmlns:w="http://schemas.openxmlformats.org/wordprocessingml/2006/main" xmlns:w14="http://schemas.microsoft.com/office/word/2010/wordml" xmlns:wpg="http://schemas.microsoft.com/office/word/2010/wordprocessingGroup" xmlns:wpi="http://schemas.microsoft.com/office/word/2010/wordprocessingInk" xmlns:wne="http://schemas.microsoft.com/office/word/2006/wordml" xmlns:wps="http://schemas.microsoft.com/office/word/2010/wordprocessingShape" mc:Ignorable="w14 wp14">
   <w:body>
-    <w:p/>
-    <w:p/>
-    <w:p/>
     <w:p>
       <w:pPr>
+        <w:spacing w:before="2400"/>
+      </w:pPr>
+    </w:p>
+    <w:p>
+      <w:pPr>
+        <w:spacing w:after="80"/>
         <w:jc w:val="center"/>
       </w:pPr>
       <w:r>
         <w:rPr>
           <w:b/>
           <w:color w:val="1F3864"/>
-          <w:sz w:val="60"/>
+          <w:sz w:val="52"/>
         </w:rPr>
-        <w:t>Early Warning System</w:t>
-        <w:br/>
-        <w:t>&amp; Prediction API</w:t>
+        <w:t>Early Warning System &amp; Prediction API</w:t>
       </w:r>
     </w:p>
     <w:p>
       <w:pPr>
+        <w:spacing w:after="200"/>
         <w:jc w:val="center"/>
       </w:pPr>
       <w:r>
         <w:rPr>
           <w:i/>
           <w:color w:val="2E75B6"/>
-          <w:sz w:val="28"/>
+          <w:sz w:val="26"/>
         </w:rPr>
         <w:t>Internship Project — Handover &amp; Documentation</w:t>
       </w:r>
     </w:p>
-    <w:p/>
     <w:p>
       <w:pPr>
+        <w:spacing w:after="360"/>
         <w:jc w:val="center"/>
       </w:pPr>
       <w:r>
@@ -43,19 +45,9 @@
           <w:color w:val="555555"/>
           <w:sz w:val="22"/>
         </w:rPr>
-        <w:t>A FastAPI backend that predicts student risk, dropout, GPA, fee</w:t>
-        <w:br/>
-        <w:t>defaults and admissions, and raises early-warning alerts for a</w:t>
-        <w:br/>
-        <w:t>Student ERP system.</w:t>
+        <w:t>A FastAPI backend that predicts student risk, dropout, GPA, fee defaults and admissions, and raises early-warning alerts for a Student ERP system.</w:t>
       </w:r>
     </w:p>
-    <w:p/>
-    <w:p/>
-    <w:p/>
-    <w:p/>
-    <w:p/>
-    <w:p/>
     <w:tbl>
       <w:tblPr>
         <w:tblW w:type="auto" w:w="0"/>
@@ -69,7 +61,7 @@
       <w:tr>
         <w:tc>
           <w:tcPr>
-            <w:tcW w:type="dxa" w:w="2880"/>
+            <w:tcW w:type="dxa" w:w="3168"/>
           </w:tcPr>
           <w:p>
             <w:r/>
@@ -85,7 +77,7 @@
         </w:tc>
         <w:tc>
           <w:tcPr>
-            <w:tcW w:type="dxa" w:w="5040"/>
+            <w:tcW w:type="dxa" w:w="5184"/>
           </w:tcPr>
           <w:p>
             <w:r/>
@@ -101,7 +93,7 @@
       <w:tr>
         <w:tc>
           <w:tcPr>
-            <w:tcW w:type="dxa" w:w="2880"/>
+            <w:tcW w:type="dxa" w:w="3168"/>
           </w:tcPr>
           <w:p>
             <w:r/>
@@ -117,7 +109,7 @@
         </w:tc>
         <w:tc>
           <w:tcPr>
-            <w:tcW w:type="dxa" w:w="5040"/>
+            <w:tcW w:type="dxa" w:w="5184"/>
           </w:tcPr>
           <w:p>
             <w:r/>
@@ -133,7 +125,7 @@
       <w:tr>
         <w:tc>
           <w:tcPr>
-            <w:tcW w:type="dxa" w:w="2880"/>
+            <w:tcW w:type="dxa" w:w="3168"/>
           </w:tcPr>
           <w:p>
             <w:r/>
@@ -149,7 +141,7 @@
         </w:tc>
         <w:tc>
           <w:tcPr>
-            <w:tcW w:type="dxa" w:w="5040"/>
+            <w:tcW w:type="dxa" w:w="5184"/>
           </w:tcPr>
           <w:p>
             <w:r/>
@@ -165,7 +157,7 @@
       <w:tr>
         <w:tc>
           <w:tcPr>
-            <w:tcW w:type="dxa" w:w="2880"/>
+            <w:tcW w:type="dxa" w:w="3168"/>
           </w:tcPr>
           <w:p>
             <w:r/>
@@ -181,7 +173,7 @@
         </w:tc>
         <w:tc>
           <w:tcPr>
-            <w:tcW w:type="dxa" w:w="5040"/>
+            <w:tcW w:type="dxa" w:w="5184"/>
           </w:tcPr>
           <w:p>
             <w:r/>
@@ -202,7 +194,8 @@
     </w:p>
     <w:p>
       <w:pPr>
-        <w:spacing w:before="280" w:after="120"/>
+        <w:keepNext/>
+        <w:spacing w:before="0" w:after="100"/>
       </w:pPr>
       <w:r>
         <w:rPr>
@@ -210,12 +203,12 @@
           <w:color w:val="1F3864"/>
           <w:sz w:val="32"/>
         </w:rPr>
-        <w:t>1. Introduction</w:t>
+        <w:t>Project links</w:t>
       </w:r>
     </w:p>
     <w:p>
       <w:pPr>
-        <w:spacing w:after="120"/>
+        <w:spacing w:after="80"/>
       </w:pPr>
       <w:r>
         <w:rPr>
@@ -223,155 +216,7 @@
           <w:i w:val="0"/>
           <w:sz w:val="22"/>
         </w:rPr>
-        <w:t>This document explains the module I built during my internship and how to use it. My task was to create the Early Warning System and the prediction API for the institute's Student ERP, and to make sure other developers (especially the frontend team) can connect to it easily.</w:t>
-      </w:r>
-    </w:p>
-    <w:p>
-      <w:pPr>
-        <w:spacing w:after="120"/>
-      </w:pPr>
-      <w:r>
-        <w:rPr>
-          <w:b w:val="0"/>
-          <w:i w:val="0"/>
-          <w:sz w:val="22"/>
-        </w:rPr>
-        <w:t>In simple terms, the system looks at a student's data — attendance, grades, assignments, fee history and engagement — and answers practical questions like: Is this student likely to fail? Might they drop out? Will their fee be paid late? It then raises alerts so the staff can act early, before a small problem becomes a big one.</w:t>
-      </w:r>
-    </w:p>
-    <w:p>
-      <w:pPr>
-        <w:spacing w:after="120"/>
-      </w:pPr>
-      <w:r>
-        <w:rPr>
-          <w:b w:val="0"/>
-          <w:i w:val="0"/>
-          <w:sz w:val="22"/>
-        </w:rPr>
-        <w:t>The whole module is built as a web API using FastAPI, it is fully tested, documented, and already deployed live on the internet so it can be demonstrated from any computer.</w:t>
-      </w:r>
-    </w:p>
-    <w:p>
-      <w:pPr>
-        <w:spacing w:before="280" w:after="120"/>
-      </w:pPr>
-      <w:r>
-        <w:rPr>
-          <w:b/>
-          <w:color w:val="1F3864"/>
-          <w:sz w:val="32"/>
-        </w:rPr>
-        <w:t>2. What was delivered</w:t>
-      </w:r>
-    </w:p>
-    <w:p>
-      <w:pPr>
-        <w:spacing w:after="120"/>
-      </w:pPr>
-      <w:r>
-        <w:rPr>
-          <w:b w:val="0"/>
-          <w:i w:val="0"/>
-          <w:sz w:val="22"/>
-        </w:rPr>
-        <w:t>All the deliverables that were asked for in the task are complete:</w:t>
-      </w:r>
-    </w:p>
-    <w:p>
-      <w:pPr>
-        <w:pStyle w:val="ListBullet"/>
-      </w:pPr>
-      <w:r>
-        <w:rPr>
-          <w:b/>
-        </w:rPr>
-        <w:t>FastAPI backend</w:t>
-      </w:r>
-      <w:r>
-        <w:t xml:space="preserve"> — six prediction endpoints plus an alerts endpoint, all working and tested.</w:t>
-      </w:r>
-    </w:p>
-    <w:p>
-      <w:pPr>
-        <w:pStyle w:val="ListBullet"/>
-      </w:pPr>
-      <w:r>
-        <w:rPr>
-          <w:b/>
-        </w:rPr>
-        <w:t>Alerts engine</w:t>
-      </w:r>
-      <w:r>
-        <w:t xml:space="preserve"> — an Early Warning System that turns prediction scores into clear, actionable alerts (fail risk, low attendance, dropout risk, fee risk).</w:t>
-      </w:r>
-    </w:p>
-    <w:p>
-      <w:pPr>
-        <w:pStyle w:val="ListBullet"/>
-      </w:pPr>
-      <w:r>
-        <w:rPr>
-          <w:b/>
-        </w:rPr>
-        <w:t>ERP integration</w:t>
-      </w:r>
-      <w:r>
-        <w:t xml:space="preserve"> — a clean integration layer that talks to the ERP. It runs on safe mock data today and can switch to the real ERP by changing one setting.</w:t>
-      </w:r>
-    </w:p>
-    <w:p>
-      <w:pPr>
-        <w:pStyle w:val="ListBullet"/>
-      </w:pPr>
-      <w:r>
-        <w:rPr>
-          <w:b/>
-        </w:rPr>
-        <w:t>API documentation</w:t>
-      </w:r>
-      <w:r>
-        <w:t xml:space="preserve"> — interactive Swagger docs, a written API reference, and this handover document.</w:t>
-      </w:r>
-    </w:p>
-    <w:p>
-      <w:pPr>
-        <w:pStyle w:val="ListBullet"/>
-      </w:pPr>
-      <w:r>
-        <w:rPr>
-          <w:b/>
-        </w:rPr>
-        <w:t>Live deployment (bonus)</w:t>
-      </w:r>
-      <w:r>
-        <w:t xml:space="preserve"> — the API is live on Hugging Face and the code is on GitHub.</w:t>
-      </w:r>
-    </w:p>
-    <w:p>
-      <w:pPr>
-        <w:spacing w:before="280" w:after="120"/>
-      </w:pPr>
-      <w:r>
-        <w:rPr>
-          <w:b/>
-          <w:color w:val="1F3864"/>
-          <w:sz w:val="32"/>
-        </w:rPr>
-        <w:t>3. How the project is organised</w:t>
-      </w:r>
-    </w:p>
-    <w:p>
-      <w:pPr>
-        <w:spacing w:after="120"/>
-      </w:pPr>
-      <w:r>
-        <w:rPr>
-          <w:b w:val="0"/>
-          <w:i w:val="0"/>
-          <w:sz w:val="22"/>
-        </w:rPr>
-        <w:t>I followed a layered architecture so the code stays clean and any developer can find their way around quickly. Each folder has exactly one job, like different stations in a kitchen:</w:t>
+        <w:t>Everything is live and available at the links below.</w:t>
       </w:r>
     </w:p>
     <w:tbl>
@@ -388,7 +233,7 @@
       <w:tr>
         <w:tc>
           <w:tcPr>
-            <w:tcW w:type="dxa" w:w="2736"/>
+            <w:tcW w:type="dxa" w:w="3600"/>
             <w:shd w:val="clear" w:color="auto" w:fill="2E75B6"/>
           </w:tcPr>
           <w:p>
@@ -399,13 +244,13 @@
                 <w:color w:val="FFFFFF"/>
                 <w:sz w:val="20"/>
               </w:rPr>
-              <w:t>Folder</w:t>
+              <w:t>Resource</w:t>
             </w:r>
           </w:p>
         </w:tc>
         <w:tc>
           <w:tcPr>
-            <w:tcW w:type="dxa" w:w="10224"/>
+            <w:tcW w:type="dxa" w:w="9360"/>
             <w:shd w:val="clear" w:color="auto" w:fill="2E75B6"/>
           </w:tcPr>
           <w:p>
@@ -416,7 +261,7 @@
                 <w:color w:val="FFFFFF"/>
                 <w:sz w:val="20"/>
               </w:rPr>
-              <w:t>Responsibility</w:t>
+              <w:t>Address</w:t>
             </w:r>
           </w:p>
         </w:tc>
@@ -424,7 +269,7 @@
       <w:tr>
         <w:tc>
           <w:tcPr>
-            <w:tcW w:type="dxa" w:w="2736"/>
+            <w:tcW w:type="dxa" w:w="3600"/>
           </w:tcPr>
           <w:p>
             <w:r/>
@@ -432,13 +277,13 @@
               <w:rPr>
                 <w:sz w:val="19"/>
               </w:rPr>
-              <w:t>app/api/routes/</w:t>
+              <w:t>Live API (base URL)</w:t>
             </w:r>
           </w:p>
         </w:tc>
         <w:tc>
           <w:tcPr>
-            <w:tcW w:type="dxa" w:w="10224"/>
+            <w:tcW w:type="dxa" w:w="9360"/>
           </w:tcPr>
           <w:p>
             <w:r/>
@@ -446,7 +291,7 @@
               <w:rPr>
                 <w:sz w:val="19"/>
               </w:rPr>
-              <w:t>The endpoints — receive requests and return responses (the 'waiter').</w:t>
+              <w:t>https://muhammadabdullah31808-early-warning-api.hf.space</w:t>
             </w:r>
           </w:p>
         </w:tc>
@@ -454,7 +299,7 @@
       <w:tr>
         <w:tc>
           <w:tcPr>
-            <w:tcW w:type="dxa" w:w="2736"/>
+            <w:tcW w:type="dxa" w:w="3600"/>
             <w:shd w:val="clear" w:color="auto" w:fill="EEF3FA"/>
           </w:tcPr>
           <w:p>
@@ -463,13 +308,13 @@
               <w:rPr>
                 <w:sz w:val="19"/>
               </w:rPr>
-              <w:t>app/schemas/</w:t>
+              <w:t>Live interactive docs</w:t>
             </w:r>
           </w:p>
         </w:tc>
         <w:tc>
           <w:tcPr>
-            <w:tcW w:type="dxa" w:w="10224"/>
+            <w:tcW w:type="dxa" w:w="9360"/>
             <w:shd w:val="clear" w:color="auto" w:fill="EEF3FA"/>
           </w:tcPr>
           <w:p>
@@ -478,7 +323,7 @@
               <w:rPr>
                 <w:sz w:val="19"/>
               </w:rPr>
-              <w:t>The shape of the data in and out, with automatic validation (the 'menu').</w:t>
+              <w:t>https://muhammadabdullah31808-early-warning-api.hf.space/docs</w:t>
             </w:r>
           </w:p>
         </w:tc>
@@ -486,7 +331,7 @@
       <w:tr>
         <w:tc>
           <w:tcPr>
-            <w:tcW w:type="dxa" w:w="2736"/>
+            <w:tcW w:type="dxa" w:w="3600"/>
           </w:tcPr>
           <w:p>
             <w:r/>
@@ -494,13 +339,13 @@
               <w:rPr>
                 <w:sz w:val="19"/>
               </w:rPr>
-              <w:t>app/services/</w:t>
+              <w:t>Source code (GitHub)</w:t>
             </w:r>
           </w:p>
         </w:tc>
         <w:tc>
           <w:tcPr>
-            <w:tcW w:type="dxa" w:w="10224"/>
+            <w:tcW w:type="dxa" w:w="9360"/>
           </w:tcPr>
           <w:p>
             <w:r/>
@@ -508,7 +353,7 @@
               <w:rPr>
                 <w:sz w:val="19"/>
               </w:rPr>
-              <w:t>The business logic — prediction and alert rules (the 'chef').</w:t>
+              <w:t>https://github.com/muhammadabdullah901/early-warning-api</w:t>
             </w:r>
           </w:p>
         </w:tc>
@@ -516,7 +361,7 @@
       <w:tr>
         <w:tc>
           <w:tcPr>
-            <w:tcW w:type="dxa" w:w="2736"/>
+            <w:tcW w:type="dxa" w:w="3600"/>
             <w:shd w:val="clear" w:color="auto" w:fill="EEF3FA"/>
           </w:tcPr>
           <w:p>
@@ -525,13 +370,13 @@
               <w:rPr>
                 <w:sz w:val="19"/>
               </w:rPr>
-              <w:t>app/models/</w:t>
+              <w:t>Hosting (Hugging Face Space)</w:t>
             </w:r>
           </w:p>
         </w:tc>
         <w:tc>
           <w:tcPr>
-            <w:tcW w:type="dxa" w:w="10224"/>
+            <w:tcW w:type="dxa" w:w="9360"/>
             <w:shd w:val="clear" w:color="auto" w:fill="EEF3FA"/>
           </w:tcPr>
           <w:p>
@@ -540,99 +385,7 @@
               <w:rPr>
                 <w:sz w:val="19"/>
               </w:rPr>
-              <w:t>The ML model placeholder — swap in a real model here later (the 'recipe').</w:t>
-            </w:r>
-          </w:p>
-        </w:tc>
-      </w:tr>
-      <w:tr>
-        <w:tc>
-          <w:tcPr>
-            <w:tcW w:type="dxa" w:w="2736"/>
-          </w:tcPr>
-          <w:p>
-            <w:r/>
-            <w:r>
-              <w:rPr>
-                <w:sz w:val="19"/>
-              </w:rPr>
-              <w:t>app/integrations/</w:t>
-            </w:r>
-          </w:p>
-        </w:tc>
-        <w:tc>
-          <w:tcPr>
-            <w:tcW w:type="dxa" w:w="10224"/>
-          </w:tcPr>
-          <w:p>
-            <w:r/>
-            <w:r>
-              <w:rPr>
-                <w:sz w:val="19"/>
-              </w:rPr>
-              <w:t>Talks to the ERP system, mock or real (the 'supplier').</w:t>
-            </w:r>
-          </w:p>
-        </w:tc>
-      </w:tr>
-      <w:tr>
-        <w:tc>
-          <w:tcPr>
-            <w:tcW w:type="dxa" w:w="2736"/>
-            <w:shd w:val="clear" w:color="auto" w:fill="EEF3FA"/>
-          </w:tcPr>
-          <w:p>
-            <w:r/>
-            <w:r>
-              <w:rPr>
-                <w:sz w:val="19"/>
-              </w:rPr>
-              <w:t>app/config.py</w:t>
-            </w:r>
-          </w:p>
-        </w:tc>
-        <w:tc>
-          <w:tcPr>
-            <w:tcW w:type="dxa" w:w="10224"/>
-            <w:shd w:val="clear" w:color="auto" w:fill="EEF3FA"/>
-          </w:tcPr>
-          <w:p>
-            <w:r/>
-            <w:r>
-              <w:rPr>
-                <w:sz w:val="19"/>
-              </w:rPr>
-              <w:t>Central settings, read from environment variables.</w:t>
-            </w:r>
-          </w:p>
-        </w:tc>
-      </w:tr>
-      <w:tr>
-        <w:tc>
-          <w:tcPr>
-            <w:tcW w:type="dxa" w:w="2736"/>
-          </w:tcPr>
-          <w:p>
-            <w:r/>
-            <w:r>
-              <w:rPr>
-                <w:sz w:val="19"/>
-              </w:rPr>
-              <w:t>tests/</w:t>
-            </w:r>
-          </w:p>
-        </w:tc>
-        <w:tc>
-          <w:tcPr>
-            <w:tcW w:type="dxa" w:w="10224"/>
-          </w:tcPr>
-          <w:p>
-            <w:r/>
-            <w:r>
-              <w:rPr>
-                <w:sz w:val="19"/>
-              </w:rPr>
-              <w:t>Automated tests that confirm every endpoint works.</w:t>
+              <w:t>https://huggingface.co/spaces/muhammadabdullah31808/early-warning-api</w:t>
             </w:r>
           </w:p>
         </w:tc>
@@ -640,34 +393,21 @@
     </w:tbl>
     <w:p>
       <w:pPr>
-        <w:spacing w:after="80"/>
+        <w:spacing w:after="40"/>
       </w:pPr>
-      <w:r>
-        <w:rPr>
-          <w:b w:val="0"/>
-          <w:i/>
-          <w:color w:val="555555"/>
-          <w:sz w:val="22"/>
-        </w:rPr>
-        <w:t>The benefit of this design: to plug in a real machine-learning model, only app/models/predictor.py changes. To connect the real ERP, only app/integrations/erp_client.py changes. Nothing else has to be touched.</w:t>
-      </w:r>
-    </w:p>
-    <w:p>
-      <w:r>
-        <w:br w:type="page"/>
-      </w:r>
     </w:p>
     <w:p>
       <w:pPr>
-        <w:spacing w:before="280" w:after="120"/>
+        <w:keepNext/>
+        <w:spacing w:before="240" w:after="100"/>
       </w:pPr>
       <w:r>
         <w:rPr>
           <w:b/>
           <w:color w:val="1F3864"/>
-          <w:sz w:val="32"/>
+          <w:sz w:val="30"/>
         </w:rPr>
-        <w:t>4. API endpoints (routes)</w:t>
+        <w:t>1. The task — what I was asked to build</w:t>
       </w:r>
     </w:p>
     <w:p>
@@ -680,7 +420,37 @@
           <w:i w:val="0"/>
           <w:sz w:val="22"/>
         </w:rPr>
-        <w:t>The API exposes the following routes. The base URL of the live deployment is:</w:t>
+        <w:t>My module for the Student ERP had two parts:</w:t>
+      </w:r>
+    </w:p>
+    <w:p>
+      <w:pPr>
+        <w:pStyle w:val="ListBullet"/>
+        <w:spacing w:after="60"/>
+      </w:pPr>
+      <w:r>
+        <w:rPr>
+          <w:b/>
+        </w:rPr>
+        <w:t>Prediction models</w:t>
+      </w:r>
+      <w:r>
+        <w:t xml:space="preserve"> — predict whether a student may fail, drop out, default on fees, their future GPA, admission chances, and personalised recommendations.</w:t>
+      </w:r>
+    </w:p>
+    <w:p>
+      <w:pPr>
+        <w:pStyle w:val="ListBullet"/>
+        <w:spacing w:after="60"/>
+      </w:pPr>
+      <w:r>
+        <w:rPr>
+          <w:b/>
+        </w:rPr>
+        <w:t>Early Warning System</w:t>
+      </w:r>
+      <w:r>
+        <w:t xml:space="preserve"> — turn those predictions into clear alerts (fail risk, low attendance, dropout risk, fee risk) and connect them with the ERP.</w:t>
       </w:r>
     </w:p>
     <w:p>
@@ -689,12 +459,141 @@
       </w:pPr>
       <w:r>
         <w:rPr>
+          <w:b w:val="0"/>
+          <w:i w:val="0"/>
+          <w:sz w:val="22"/>
+        </w:rPr>
+        <w:t>The deliverables were a FastAPI backend, ERP integration, and API documentation. All are complete, and the API is also deployed live.</w:t>
+      </w:r>
+    </w:p>
+    <w:p>
+      <w:pPr>
+        <w:keepNext/>
+        <w:spacing w:before="240" w:after="100"/>
+      </w:pPr>
+      <w:r>
+        <w:rPr>
+          <w:b/>
+          <w:color w:val="1F3864"/>
+          <w:sz w:val="30"/>
+        </w:rPr>
+        <w:t>2. What I built (summary)</w:t>
+      </w:r>
+    </w:p>
+    <w:p>
+      <w:pPr>
+        <w:pStyle w:val="ListBullet"/>
+        <w:spacing w:after="60"/>
+      </w:pPr>
+      <w:r>
+        <w:rPr>
+          <w:b/>
+        </w:rPr>
+        <w:t>FastAPI backend</w:t>
+      </w:r>
+      <w:r>
+        <w:t xml:space="preserve"> — 6 prediction endpoints + 1 alerts endpoint, all working and tested.</w:t>
+      </w:r>
+    </w:p>
+    <w:p>
+      <w:pPr>
+        <w:pStyle w:val="ListBullet"/>
+        <w:spacing w:after="60"/>
+      </w:pPr>
+      <w:r>
+        <w:rPr>
+          <w:b/>
+        </w:rPr>
+        <w:t>Alerts engine</w:t>
+      </w:r>
+      <w:r>
+        <w:t xml:space="preserve"> — converts prediction scores into actionable alerts with a severity level.</w:t>
+      </w:r>
+    </w:p>
+    <w:p>
+      <w:pPr>
+        <w:pStyle w:val="ListBullet"/>
+        <w:spacing w:after="60"/>
+      </w:pPr>
+      <w:r>
+        <w:rPr>
+          <w:b/>
+        </w:rPr>
+        <w:t>ERP integration</w:t>
+      </w:r>
+      <w:r>
+        <w:t xml:space="preserve"> — one clean layer that talks to the ERP; runs on mock data now, switches to the real ERP with one setting.</w:t>
+      </w:r>
+    </w:p>
+    <w:p>
+      <w:pPr>
+        <w:pStyle w:val="ListBullet"/>
+        <w:spacing w:after="60"/>
+      </w:pPr>
+      <w:r>
+        <w:rPr>
+          <w:b/>
+        </w:rPr>
+        <w:t>Documentation</w:t>
+      </w:r>
+      <w:r>
+        <w:t xml:space="preserve"> — interactive Swagger docs, a written reference, and this document.</w:t>
+      </w:r>
+    </w:p>
+    <w:p>
+      <w:pPr>
+        <w:pStyle w:val="ListBullet"/>
+        <w:spacing w:after="60"/>
+      </w:pPr>
+      <w:r>
+        <w:rPr>
+          <w:b/>
+        </w:rPr>
+        <w:t>Live deployment</w:t>
+      </w:r>
+      <w:r>
+        <w:t xml:space="preserve"> — the API runs on the internet (Hugging Face) with the code on GitHub.</w:t>
+      </w:r>
+    </w:p>
+    <w:p>
+      <w:pPr>
+        <w:keepNext/>
+        <w:spacing w:before="240" w:after="100"/>
+      </w:pPr>
+      <w:r>
+        <w:rPr>
+          <w:b/>
+          <w:color w:val="1F3864"/>
+          <w:sz w:val="30"/>
+        </w:rPr>
+        <w:t>3. The API routes (with full addresses)</w:t>
+      </w:r>
+    </w:p>
+    <w:p>
+      <w:pPr>
+        <w:spacing w:after="80"/>
+      </w:pPr>
+      <w:r>
+        <w:rPr>
           <w:b/>
           <w:i w:val="0"/>
           <w:color w:val="2E75B6"/>
           <w:sz w:val="22"/>
         </w:rPr>
-        <w:t>https://muhammadabdullah31808-early-warning-api.hf.space</w:t>
+        <w:t>Base URL: https://muhammadabdullah31808-early-warning-api.hf.space</w:t>
+      </w:r>
+    </w:p>
+    <w:p>
+      <w:pPr>
+        <w:spacing w:after="120"/>
+      </w:pPr>
+      <w:r>
+        <w:rPr>
+          <w:b w:val="0"/>
+          <w:i w:val="0"/>
+          <w:sz w:val="22"/>
+        </w:rPr>
+        <w:t>The full address of any route = base URL + the path below. For example, the student-risk route is at .../prediction/student-risk.</w:t>
       </w:r>
     </w:p>
     <w:tbl>
@@ -712,7 +611,7 @@
       <w:tr>
         <w:tc>
           <w:tcPr>
-            <w:tcW w:type="dxa" w:w="1440"/>
+            <w:tcW w:type="dxa" w:w="1296"/>
             <w:shd w:val="clear" w:color="auto" w:fill="2E75B6"/>
           </w:tcPr>
           <w:p>
@@ -740,13 +639,13 @@
                 <w:color w:val="FFFFFF"/>
                 <w:sz w:val="20"/>
               </w:rPr>
-              <w:t>Route</w:t>
+              <w:t>Path</w:t>
             </w:r>
           </w:p>
         </w:tc>
         <w:tc>
           <w:tcPr>
-            <w:tcW w:type="dxa" w:w="6768"/>
+            <w:tcW w:type="dxa" w:w="6912"/>
             <w:shd w:val="clear" w:color="auto" w:fill="2E75B6"/>
           </w:tcPr>
           <w:p>
@@ -765,7 +664,7 @@
       <w:tr>
         <w:tc>
           <w:tcPr>
-            <w:tcW w:type="dxa" w:w="1440"/>
+            <w:tcW w:type="dxa" w:w="1296"/>
           </w:tcPr>
           <w:p>
             <w:r/>
@@ -793,7 +692,7 @@
         </w:tc>
         <w:tc>
           <w:tcPr>
-            <w:tcW w:type="dxa" w:w="6768"/>
+            <w:tcW w:type="dxa" w:w="6912"/>
           </w:tcPr>
           <w:p>
             <w:r/>
@@ -801,7 +700,7 @@
               <w:rPr>
                 <w:sz w:val="19"/>
               </w:rPr>
-              <w:t>Quick check that the server is running.</w:t>
+              <w:t>Check the server is running.</w:t>
             </w:r>
           </w:p>
         </w:tc>
@@ -809,7 +708,7 @@
       <w:tr>
         <w:tc>
           <w:tcPr>
-            <w:tcW w:type="dxa" w:w="1440"/>
+            <w:tcW w:type="dxa" w:w="1296"/>
             <w:shd w:val="clear" w:color="auto" w:fill="EEF3FA"/>
           </w:tcPr>
           <w:p>
@@ -839,7 +738,7 @@
         </w:tc>
         <w:tc>
           <w:tcPr>
-            <w:tcW w:type="dxa" w:w="6768"/>
+            <w:tcW w:type="dxa" w:w="6912"/>
             <w:shd w:val="clear" w:color="auto" w:fill="EEF3FA"/>
           </w:tcPr>
           <w:p>
@@ -848,7 +747,7 @@
               <w:rPr>
                 <w:sz w:val="19"/>
               </w:rPr>
-              <w:t>Overall academic risk and whether the student may fail.</w:t>
+              <w:t>Academic risk + whether the student may fail.</w:t>
             </w:r>
           </w:p>
         </w:tc>
@@ -856,7 +755,7 @@
       <w:tr>
         <w:tc>
           <w:tcPr>
-            <w:tcW w:type="dxa" w:w="1440"/>
+            <w:tcW w:type="dxa" w:w="1296"/>
           </w:tcPr>
           <w:p>
             <w:r/>
@@ -884,7 +783,7 @@
         </w:tc>
         <w:tc>
           <w:tcPr>
-            <w:tcW w:type="dxa" w:w="6768"/>
+            <w:tcW w:type="dxa" w:w="6912"/>
           </w:tcPr>
           <w:p>
             <w:r/>
@@ -892,7 +791,7 @@
               <w:rPr>
                 <w:sz w:val="19"/>
               </w:rPr>
-              <w:t>Probability that the student will drop out.</w:t>
+              <w:t>Probability the student drops out.</w:t>
             </w:r>
           </w:p>
         </w:tc>
@@ -900,7 +799,7 @@
       <w:tr>
         <w:tc>
           <w:tcPr>
-            <w:tcW w:type="dxa" w:w="1440"/>
+            <w:tcW w:type="dxa" w:w="1296"/>
             <w:shd w:val="clear" w:color="auto" w:fill="EEF3FA"/>
           </w:tcPr>
           <w:p>
@@ -930,7 +829,7 @@
         </w:tc>
         <w:tc>
           <w:tcPr>
-            <w:tcW w:type="dxa" w:w="6768"/>
+            <w:tcW w:type="dxa" w:w="6912"/>
             <w:shd w:val="clear" w:color="auto" w:fill="EEF3FA"/>
           </w:tcPr>
           <w:p>
@@ -939,7 +838,7 @@
               <w:rPr>
                 <w:sz w:val="19"/>
               </w:rPr>
-              <w:t>Predicted GPA for the next term.</w:t>
+              <w:t>Predicted GPA for next term.</w:t>
             </w:r>
           </w:p>
         </w:tc>
@@ -947,7 +846,7 @@
       <w:tr>
         <w:tc>
           <w:tcPr>
-            <w:tcW w:type="dxa" w:w="1440"/>
+            <w:tcW w:type="dxa" w:w="1296"/>
           </w:tcPr>
           <w:p>
             <w:r/>
@@ -975,7 +874,7 @@
         </w:tc>
         <w:tc>
           <w:tcPr>
-            <w:tcW w:type="dxa" w:w="6768"/>
+            <w:tcW w:type="dxa" w:w="6912"/>
           </w:tcPr>
           <w:p>
             <w:r/>
@@ -983,7 +882,7 @@
               <w:rPr>
                 <w:sz w:val="19"/>
               </w:rPr>
-              <w:t>Probability the fee will be defaulted / paid late.</w:t>
+              <w:t>Probability the fee is defaulted / paid late.</w:t>
             </w:r>
           </w:p>
         </w:tc>
@@ -991,7 +890,7 @@
       <w:tr>
         <w:tc>
           <w:tcPr>
-            <w:tcW w:type="dxa" w:w="1440"/>
+            <w:tcW w:type="dxa" w:w="1296"/>
             <w:shd w:val="clear" w:color="auto" w:fill="EEF3FA"/>
           </w:tcPr>
           <w:p>
@@ -1021,7 +920,7 @@
         </w:tc>
         <w:tc>
           <w:tcPr>
-            <w:tcW w:type="dxa" w:w="6768"/>
+            <w:tcW w:type="dxa" w:w="6912"/>
             <w:shd w:val="clear" w:color="auto" w:fill="EEF3FA"/>
           </w:tcPr>
           <w:p>
@@ -1030,7 +929,7 @@
               <w:rPr>
                 <w:sz w:val="19"/>
               </w:rPr>
-              <w:t>Admission probability and a decision for an applicant.</w:t>
+              <w:t>Admission probability + decision for an applicant.</w:t>
             </w:r>
           </w:p>
         </w:tc>
@@ -1038,7 +937,7 @@
       <w:tr>
         <w:tc>
           <w:tcPr>
-            <w:tcW w:type="dxa" w:w="1440"/>
+            <w:tcW w:type="dxa" w:w="1296"/>
           </w:tcPr>
           <w:p>
             <w:r/>
@@ -1066,7 +965,7 @@
         </w:tc>
         <w:tc>
           <w:tcPr>
-            <w:tcW w:type="dxa" w:w="6768"/>
+            <w:tcW w:type="dxa" w:w="6912"/>
           </w:tcPr>
           <w:p>
             <w:r/>
@@ -1074,7 +973,7 @@
               <w:rPr>
                 <w:sz w:val="19"/>
               </w:rPr>
-              <w:t>Personalised suggestions to help the student improve.</w:t>
+              <w:t>Personalised suggestions for the student.</w:t>
             </w:r>
           </w:p>
         </w:tc>
@@ -1082,7 +981,7 @@
       <w:tr>
         <w:tc>
           <w:tcPr>
-            <w:tcW w:type="dxa" w:w="1440"/>
+            <w:tcW w:type="dxa" w:w="1296"/>
             <w:shd w:val="clear" w:color="auto" w:fill="EEF3FA"/>
           </w:tcPr>
           <w:p>
@@ -1112,7 +1011,7 @@
         </w:tc>
         <w:tc>
           <w:tcPr>
-            <w:tcW w:type="dxa" w:w="6768"/>
+            <w:tcW w:type="dxa" w:w="6912"/>
             <w:shd w:val="clear" w:color="auto" w:fill="EEF3FA"/>
           </w:tcPr>
           <w:p>
@@ -1129,7 +1028,13 @@
     </w:tbl>
     <w:p>
       <w:pPr>
-        <w:spacing w:before="200" w:after="80"/>
+        <w:spacing w:after="40"/>
+      </w:pPr>
+    </w:p>
+    <w:p>
+      <w:pPr>
+        <w:keepNext/>
+        <w:spacing w:before="160" w:after="80"/>
       </w:pPr>
       <w:r>
         <w:rPr>
@@ -1137,7 +1042,7 @@
           <w:color w:val="2E75B6"/>
           <w:sz w:val="26"/>
         </w:rPr>
-        <w:t>Example request and response</w:t>
+        <w:t>Example — request and the real response from the live server</w:t>
       </w:r>
     </w:p>
     <w:p>
@@ -1150,10 +1055,14 @@
           <w:i w:val="0"/>
           <w:sz w:val="22"/>
         </w:rPr>
-        <w:t>Request — POST /prediction/student-risk</w:t>
+        <w:t>POST /prediction/student-risk  — request body:</w:t>
       </w:r>
     </w:p>
     <w:p>
+      <w:pPr>
+        <w:spacing w:after="160"/>
+        <w:ind w:left="216"/>
+      </w:pPr>
       <w:r>
         <w:rPr>
           <w:rFonts w:ascii="Consolas" w:hAnsi="Consolas"/>
@@ -1186,10 +1095,14 @@
           <w:i w:val="0"/>
           <w:sz w:val="22"/>
         </w:rPr>
-        <w:t>Response (actual output from the live server)</w:t>
+        <w:t>Response (actual output):</w:t>
       </w:r>
     </w:p>
     <w:p>
+      <w:pPr>
+        <w:spacing w:after="160"/>
+        <w:ind w:left="216"/>
+      </w:pPr>
       <w:r>
         <w:rPr>
           <w:rFonts w:ascii="Consolas" w:hAnsi="Consolas"/>
@@ -1221,19 +1134,151 @@
       </w:r>
     </w:p>
     <w:p>
-      <w:r>
-        <w:br w:type="page"/>
-      </w:r>
-    </w:p>
-    <w:p>
       <w:pPr>
-        <w:spacing w:before="280" w:after="120"/>
+        <w:keepNext/>
+        <w:spacing w:before="240" w:after="100"/>
       </w:pPr>
       <w:r>
         <w:rPr>
           <w:b/>
           <w:color w:val="1F3864"/>
-          <w:sz w:val="32"/>
+          <w:sz w:val="30"/>
+        </w:rPr>
+        <w:t>4. How a frontend developer uses this API</w:t>
+      </w:r>
+    </w:p>
+    <w:p>
+      <w:pPr>
+        <w:spacing w:after="120"/>
+      </w:pPr>
+      <w:r>
+        <w:rPr>
+          <w:b w:val="0"/>
+          <w:i w:val="0"/>
+          <w:sz w:val="22"/>
+        </w:rPr>
+        <w:t>The API is a standard REST + JSON service, so any frontend (React, Angular, Vue, plain JavaScript or mobile) can call it. No API key is needed right now, and CORS is enabled so it works directly from the browser. Three easy ways:</w:t>
+      </w:r>
+    </w:p>
+    <w:p>
+      <w:pPr>
+        <w:pStyle w:val="ListBullet"/>
+        <w:spacing w:after="60"/>
+      </w:pPr>
+      <w:r>
+        <w:rPr>
+          <w:b/>
+        </w:rPr>
+        <w:t>1. In the browser</w:t>
+      </w:r>
+      <w:r>
+        <w:t xml:space="preserve"> — open the live docs (…/docs), press 'Try it out' on any route, edit the data, press Execute. The response shows instantly.</w:t>
+      </w:r>
+    </w:p>
+    <w:p>
+      <w:pPr>
+        <w:pStyle w:val="ListBullet"/>
+        <w:spacing w:after="60"/>
+      </w:pPr>
+      <w:r>
+        <w:rPr>
+          <w:b/>
+        </w:rPr>
+        <w:t>2. From code</w:t>
+      </w:r>
+      <w:r>
+        <w:t xml:space="preserve"> — send a normal HTTP request from the app (example below).</w:t>
+      </w:r>
+    </w:p>
+    <w:p>
+      <w:pPr>
+        <w:pStyle w:val="ListBullet"/>
+        <w:spacing w:after="60"/>
+      </w:pPr>
+      <w:r>
+        <w:rPr>
+          <w:b/>
+        </w:rPr>
+        <w:t>3. Quick check</w:t>
+      </w:r>
+      <w:r>
+        <w:t xml:space="preserve"> — open a GET route (…/health, …/alerts/student/STU-1001) directly in a browser.</w:t>
+      </w:r>
+    </w:p>
+    <w:p>
+      <w:pPr>
+        <w:spacing w:after="40"/>
+      </w:pPr>
+      <w:r>
+        <w:rPr>
+          <w:b/>
+          <w:i w:val="0"/>
+          <w:sz w:val="22"/>
+        </w:rPr>
+        <w:t>JavaScript example (fetch):</w:t>
+      </w:r>
+    </w:p>
+    <w:p>
+      <w:pPr>
+        <w:spacing w:after="160"/>
+        <w:ind w:left="216"/>
+      </w:pPr>
+      <w:r>
+        <w:rPr>
+          <w:rFonts w:ascii="Consolas" w:hAnsi="Consolas"/>
+          <w:sz w:val="19"/>
+        </w:rPr>
+        <w:t>const res = await fetch(</w:t>
+        <w:br/>
+        <w:t xml:space="preserve">  'https://muhammadabdullah31808-early-warning-api.hf.space/prediction/student-risk',</w:t>
+        <w:br/>
+        <w:t xml:space="preserve">  {</w:t>
+        <w:br/>
+        <w:t xml:space="preserve">    method: 'POST',</w:t>
+        <w:br/>
+        <w:t xml:space="preserve">    headers: { 'Content-Type': 'application/json' },</w:t>
+        <w:br/>
+        <w:t xml:space="preserve">    body: JSON.stringify({</w:t>
+        <w:br/>
+        <w:t xml:space="preserve">      student_id: 'STU-1001', attendance_percentage: 45, current_gpa: 1.6,</w:t>
+        <w:br/>
+        <w:t xml:space="preserve">      assignments_submitted: 2, assignments_total: 10, backlogs: 3</w:t>
+        <w:br/>
+        <w:t xml:space="preserve">    })</w:t>
+        <w:br/>
+        <w:t xml:space="preserve">  }</w:t>
+        <w:br/>
+        <w:t>);</w:t>
+        <w:br/>
+        <w:t>const data = await res.json();</w:t>
+        <w:br/>
+        <w:t>console.log(data.risk_level, data.may_fail, data.alerts);</w:t>
+      </w:r>
+    </w:p>
+    <w:p>
+      <w:pPr>
+        <w:spacing w:after="120"/>
+      </w:pPr>
+      <w:r>
+        <w:rPr>
+          <w:b w:val="0"/>
+          <w:i/>
+          <w:color w:val="555555"/>
+          <w:sz w:val="22"/>
+        </w:rPr>
+        <w:t>The frontend reads the JSON response (risk_score, risk_level, may_fail, alerts) and shows it on screen. Every route's exact fields are listed on the …/docs page, so the frontend developer never has to guess.</w:t>
+      </w:r>
+    </w:p>
+    <w:p>
+      <w:pPr>
+        <w:keepNext/>
+        <w:spacing w:before="240" w:after="100"/>
+      </w:pPr>
+      <w:r>
+        <w:rPr>
+          <w:b/>
+          <w:color w:val="1F3864"/>
+          <w:sz w:val="30"/>
         </w:rPr>
         <w:t>5. The Early Warning System</w:t>
       </w:r>
@@ -1248,12 +1293,13 @@
           <w:i w:val="0"/>
           <w:sz w:val="22"/>
         </w:rPr>
-        <w:t>This is the heart of the module. After a prediction is calculated, the alert engine checks the result against sensible thresholds and produces alerts. Each alert has a type, a severity (low / medium / high), a human-readable message, and a score. The four alert types are:</w:t>
+        <w:t>After a prediction is calculated, the alert engine checks it against sensible thresholds and produces alerts. Each alert has a type, a severity (low / medium / high) and a clear message. The four alert types are:</w:t>
       </w:r>
     </w:p>
     <w:p>
       <w:pPr>
         <w:pStyle w:val="ListBullet"/>
+        <w:spacing w:after="60"/>
       </w:pPr>
       <w:r>
         <w:rPr>
@@ -1262,12 +1308,13 @@
         <w:t>Student may fail</w:t>
       </w:r>
       <w:r>
-        <w:t xml:space="preserve"> — raised when the academic risk is high enough that the student may fail.</w:t>
+        <w:t xml:space="preserve"> — academic risk is high enough that the student may fail.</w:t>
       </w:r>
     </w:p>
     <w:p>
       <w:pPr>
         <w:pStyle w:val="ListBullet"/>
+        <w:spacing w:after="60"/>
       </w:pPr>
       <w:r>
         <w:rPr>
@@ -1276,12 +1323,13 @@
         <w:t>Low attendance</w:t>
       </w:r>
       <w:r>
-        <w:t xml:space="preserve"> — raised when attendance falls below the required 75%.</w:t>
+        <w:t xml:space="preserve"> — attendance is below the required 75%.</w:t>
       </w:r>
     </w:p>
     <w:p>
       <w:pPr>
         <w:pStyle w:val="ListBullet"/>
+        <w:spacing w:after="60"/>
       </w:pPr>
       <w:r>
         <w:rPr>
@@ -1290,12 +1338,13 @@
         <w:t>Dropout risk</w:t>
       </w:r>
       <w:r>
-        <w:t xml:space="preserve"> — raised when the dropout probability is high.</w:t>
+        <w:t xml:space="preserve"> — the dropout probability is high.</w:t>
       </w:r>
     </w:p>
     <w:p>
       <w:pPr>
         <w:pStyle w:val="ListBullet"/>
+        <w:spacing w:after="60"/>
       </w:pPr>
       <w:r>
         <w:rPr>
@@ -1304,7 +1353,7 @@
         <w:t>Fee payment risk</w:t>
       </w:r>
       <w:r>
-        <w:t xml:space="preserve"> — raised when the student is likely to pay the fee late or default.</w:t>
+        <w:t xml:space="preserve"> — the student is likely to pay late or default.</w:t>
       </w:r>
     </w:p>
     <w:p>
@@ -1317,18 +1366,19 @@
           <w:i w:val="0"/>
           <w:sz w:val="22"/>
         </w:rPr>
-        <w:t>The GET /alerts/student/{id} endpoint shows the full Early Warning flow: it fetches the student's record from the ERP, runs the checks, and returns every alert that applies. In a real setup these alerts are also pushed back into the ERP so staff can see them on their dashboard.</w:t>
+        <w:t>The GET /alerts/student/{id} route shows the full flow: it reads the student's record from the ERP, runs the checks, and returns every alert that applies (and pushes them back to the ERP in a real setup).</w:t>
       </w:r>
     </w:p>
     <w:p>
       <w:pPr>
-        <w:spacing w:before="280" w:after="120"/>
+        <w:keepNext/>
+        <w:spacing w:before="240" w:after="100"/>
       </w:pPr>
       <w:r>
         <w:rPr>
           <w:b/>
           <w:color w:val="1F3864"/>
-          <w:sz w:val="32"/>
+          <w:sz w:val="30"/>
         </w:rPr>
         <w:t>6. ERP integration</w:t>
       </w:r>
@@ -1343,12 +1393,13 @@
           <w:i w:val="0"/>
           <w:sz w:val="22"/>
         </w:rPr>
-        <w:t>All communication with the ERP happens in one file: app/integrations/erp_client.py. It has two modes, controlled by a single setting (ERP_MOCK_MODE):</w:t>
+        <w:t>All ERP communication lives in one file (app/integrations/erp_client.py), with two modes controlled by the ERP_MOCK_MODE setting:</w:t>
       </w:r>
     </w:p>
     <w:p>
       <w:pPr>
         <w:pStyle w:val="ListBullet"/>
+        <w:spacing w:after="60"/>
       </w:pPr>
       <w:r>
         <w:rPr>
@@ -1357,12 +1408,13 @@
         <w:t>Mock mode</w:t>
       </w:r>
       <w:r>
-        <w:t xml:space="preserve"> — the default. It returns realistic sample students, so the whole system works without needing the real ERP or the internet. This is what the live demo uses today.</w:t>
+        <w:t xml:space="preserve"> — the default; returns realistic sample students so the system works without the real ERP. This is what the live demo uses.</w:t>
       </w:r>
     </w:p>
     <w:p>
       <w:pPr>
         <w:pStyle w:val="ListBullet"/>
+        <w:spacing w:after="60"/>
       </w:pPr>
       <w:r>
         <w:rPr>
@@ -1371,20 +1423,21 @@
         <w:t>Real mode</w:t>
       </w:r>
       <w:r>
-        <w:t xml:space="preserve"> — set ERP_MOCK_MODE=false and provide the ERP base URL and API key, and the same code will talk to the real ERP over HTTP. No other change needed.</w:t>
+        <w:t xml:space="preserve"> — set ERP_MOCK_MODE=false and add the ERP URL + API key; the same code then talks to the real ERP. No other change needed.</w:t>
       </w:r>
     </w:p>
     <w:p>
       <w:pPr>
-        <w:spacing w:before="280" w:after="120"/>
+        <w:keepNext/>
+        <w:spacing w:before="240" w:after="100"/>
       </w:pPr>
       <w:r>
         <w:rPr>
           <w:b/>
           <w:color w:val="1F3864"/>
-          <w:sz w:val="32"/>
+          <w:sz w:val="30"/>
         </w:rPr>
-        <w:t>7. Deployment</w:t>
+        <w:t>7. How the code is organised</w:t>
       </w:r>
     </w:p>
     <w:p>
@@ -1397,7 +1450,7 @@
           <w:i w:val="0"/>
           <w:sz w:val="22"/>
         </w:rPr>
-        <w:t>The project is deployed in two places that stay in sync:</w:t>
+        <w:t>I used a layered structure so any developer can navigate it quickly — each folder has one job:</w:t>
       </w:r>
     </w:p>
     <w:tbl>
@@ -1408,14 +1461,13 @@
         <w:tblLook w:firstColumn="1" w:firstRow="1" w:lastColumn="0" w:lastRow="0" w:noHBand="0" w:noVBand="1" w:val="04A0"/>
       </w:tblPr>
       <w:tblGrid>
-        <w:gridCol w:w="2880"/>
-        <w:gridCol w:w="2880"/>
-        <w:gridCol w:w="2880"/>
+        <w:gridCol w:w="4320"/>
+        <w:gridCol w:w="4320"/>
       </w:tblGrid>
       <w:tr>
         <w:tc>
           <w:tcPr>
-            <w:tcW w:type="dxa" w:w="2448"/>
+            <w:tcW w:type="dxa" w:w="3168"/>
             <w:shd w:val="clear" w:color="auto" w:fill="2E75B6"/>
           </w:tcPr>
           <w:p>
@@ -1426,13 +1478,13 @@
                 <w:color w:val="FFFFFF"/>
                 <w:sz w:val="20"/>
               </w:rPr>
-              <w:t>Where</w:t>
+              <w:t>Folder</w:t>
             </w:r>
           </w:p>
         </w:tc>
         <w:tc>
           <w:tcPr>
-            <w:tcW w:type="dxa" w:w="3600"/>
+            <w:tcW w:type="dxa" w:w="9792"/>
             <w:shd w:val="clear" w:color="auto" w:fill="2E75B6"/>
           </w:tcPr>
           <w:p>
@@ -1443,24 +1495,7 @@
                 <w:color w:val="FFFFFF"/>
                 <w:sz w:val="20"/>
               </w:rPr>
-              <w:t>Purpose</w:t>
-            </w:r>
-          </w:p>
-        </w:tc>
-        <w:tc>
-          <w:tcPr>
-            <w:tcW w:type="dxa" w:w="6912"/>
-            <w:shd w:val="clear" w:color="auto" w:fill="2E75B6"/>
-          </w:tcPr>
-          <w:p>
-            <w:r/>
-            <w:r>
-              <w:rPr>
-                <w:b/>
-                <w:color w:val="FFFFFF"/>
-                <w:sz w:val="20"/>
-              </w:rPr>
-              <w:t>Link</w:t>
+              <w:t>Responsibility</w:t>
             </w:r>
           </w:p>
         </w:tc>
@@ -1468,7 +1503,7 @@
       <w:tr>
         <w:tc>
           <w:tcPr>
-            <w:tcW w:type="dxa" w:w="2448"/>
+            <w:tcW w:type="dxa" w:w="3168"/>
           </w:tcPr>
           <w:p>
             <w:r/>
@@ -1476,13 +1511,13 @@
               <w:rPr>
                 <w:sz w:val="19"/>
               </w:rPr>
-              <w:t>GitHub</w:t>
+              <w:t>app/api/routes/</w:t>
             </w:r>
           </w:p>
         </w:tc>
         <w:tc>
           <w:tcPr>
-            <w:tcW w:type="dxa" w:w="3600"/>
+            <w:tcW w:type="dxa" w:w="9792"/>
           </w:tcPr>
           <w:p>
             <w:r/>
@@ -1490,21 +1525,7 @@
               <w:rPr>
                 <w:sz w:val="19"/>
               </w:rPr>
-              <w:t>Source code repository</w:t>
-            </w:r>
-          </w:p>
-        </w:tc>
-        <w:tc>
-          <w:tcPr>
-            <w:tcW w:type="dxa" w:w="6912"/>
-          </w:tcPr>
-          <w:p>
-            <w:r/>
-            <w:r>
-              <w:rPr>
-                <w:sz w:val="19"/>
-              </w:rPr>
-              <w:t>github.com/muhammadabdullah901/early-warning-api</w:t>
+              <w:t>The endpoints — receive requests, return responses.</w:t>
             </w:r>
           </w:p>
         </w:tc>
@@ -1512,7 +1533,7 @@
       <w:tr>
         <w:tc>
           <w:tcPr>
-            <w:tcW w:type="dxa" w:w="2448"/>
+            <w:tcW w:type="dxa" w:w="3168"/>
             <w:shd w:val="clear" w:color="auto" w:fill="EEF3FA"/>
           </w:tcPr>
           <w:p>
@@ -1521,13 +1542,13 @@
               <w:rPr>
                 <w:sz w:val="19"/>
               </w:rPr>
-              <w:t>Hugging Face Space</w:t>
+              <w:t>app/schemas/</w:t>
             </w:r>
           </w:p>
         </w:tc>
         <w:tc>
           <w:tcPr>
-            <w:tcW w:type="dxa" w:w="3600"/>
+            <w:tcW w:type="dxa" w:w="9792"/>
             <w:shd w:val="clear" w:color="auto" w:fill="EEF3FA"/>
           </w:tcPr>
           <w:p>
@@ -1536,13 +1557,45 @@
               <w:rPr>
                 <w:sz w:val="19"/>
               </w:rPr>
-              <w:t>Live running API (Docker)</w:t>
+              <w:t>Data shapes with automatic validation.</w:t>
+            </w:r>
+          </w:p>
+        </w:tc>
+      </w:tr>
+      <w:tr>
+        <w:tc>
+          <w:tcPr>
+            <w:tcW w:type="dxa" w:w="3168"/>
+          </w:tcPr>
+          <w:p>
+            <w:r/>
+            <w:r>
+              <w:rPr>
+                <w:sz w:val="19"/>
+              </w:rPr>
+              <w:t>app/services/</w:t>
             </w:r>
           </w:p>
         </w:tc>
         <w:tc>
           <w:tcPr>
-            <w:tcW w:type="dxa" w:w="6912"/>
+            <w:tcW w:type="dxa" w:w="9792"/>
+          </w:tcPr>
+          <w:p>
+            <w:r/>
+            <w:r>
+              <w:rPr>
+                <w:sz w:val="19"/>
+              </w:rPr>
+              <w:t>Business logic — prediction and alert rules.</w:t>
+            </w:r>
+          </w:p>
+        </w:tc>
+      </w:tr>
+      <w:tr>
+        <w:tc>
+          <w:tcPr>
+            <w:tcW w:type="dxa" w:w="3168"/>
             <w:shd w:val="clear" w:color="auto" w:fill="EEF3FA"/>
           </w:tcPr>
           <w:p>
@@ -1551,59 +1604,13 @@
               <w:rPr>
                 <w:sz w:val="19"/>
               </w:rPr>
-              <w:t>huggingface.co/spaces/muhammadabdullah31808/early-warning-api</w:t>
-            </w:r>
-          </w:p>
-        </w:tc>
-      </w:tr>
-      <w:tr>
-        <w:tc>
-          <w:tcPr>
-            <w:tcW w:type="dxa" w:w="2448"/>
-          </w:tcPr>
-          <w:p>
-            <w:r/>
-            <w:r>
-              <w:rPr>
-                <w:sz w:val="19"/>
-              </w:rPr>
-              <w:t>Live API</w:t>
+              <w:t>app/models/</w:t>
             </w:r>
           </w:p>
         </w:tc>
         <w:tc>
           <w:tcPr>
-            <w:tcW w:type="dxa" w:w="3600"/>
-          </w:tcPr>
-          <w:p>
-            <w:r/>
-            <w:r>
-              <w:rPr>
-                <w:sz w:val="19"/>
-              </w:rPr>
-              <w:t>Public base URL</w:t>
-            </w:r>
-          </w:p>
-        </w:tc>
-        <w:tc>
-          <w:tcPr>
-            <w:tcW w:type="dxa" w:w="6912"/>
-          </w:tcPr>
-          <w:p>
-            <w:r/>
-            <w:r>
-              <w:rPr>
-                <w:sz w:val="19"/>
-              </w:rPr>
-              <w:t>muhammadabdullah31808-early-warning-api.hf.space</w:t>
-            </w:r>
-          </w:p>
-        </w:tc>
-      </w:tr>
-      <w:tr>
-        <w:tc>
-          <w:tcPr>
-            <w:tcW w:type="dxa" w:w="2448"/>
+            <w:tcW w:type="dxa" w:w="9792"/>
             <w:shd w:val="clear" w:color="auto" w:fill="EEF3FA"/>
           </w:tcPr>
           <w:p>
@@ -1612,13 +1619,45 @@
               <w:rPr>
                 <w:sz w:val="19"/>
               </w:rPr>
-              <w:t>Live docs</w:t>
+              <w:t>ML model placeholder — swap in a real model here later.</w:t>
+            </w:r>
+          </w:p>
+        </w:tc>
+      </w:tr>
+      <w:tr>
+        <w:tc>
+          <w:tcPr>
+            <w:tcW w:type="dxa" w:w="3168"/>
+          </w:tcPr>
+          <w:p>
+            <w:r/>
+            <w:r>
+              <w:rPr>
+                <w:sz w:val="19"/>
+              </w:rPr>
+              <w:t>app/integrations/</w:t>
             </w:r>
           </w:p>
         </w:tc>
         <w:tc>
           <w:tcPr>
-            <w:tcW w:type="dxa" w:w="3600"/>
+            <w:tcW w:type="dxa" w:w="9792"/>
+          </w:tcPr>
+          <w:p>
+            <w:r/>
+            <w:r>
+              <w:rPr>
+                <w:sz w:val="19"/>
+              </w:rPr>
+              <w:t>Talks to the ERP (mock or real).</w:t>
+            </w:r>
+          </w:p>
+        </w:tc>
+      </w:tr>
+      <w:tr>
+        <w:tc>
+          <w:tcPr>
+            <w:tcW w:type="dxa" w:w="3168"/>
             <w:shd w:val="clear" w:color="auto" w:fill="EEF3FA"/>
           </w:tcPr>
           <w:p>
@@ -1627,13 +1666,13 @@
               <w:rPr>
                 <w:sz w:val="19"/>
               </w:rPr>
-              <w:t>Interactive Swagger UI</w:t>
+              <w:t>tests/</w:t>
             </w:r>
           </w:p>
         </w:tc>
         <w:tc>
           <w:tcPr>
-            <w:tcW w:type="dxa" w:w="6912"/>
+            <w:tcW w:type="dxa" w:w="9792"/>
             <w:shd w:val="clear" w:color="auto" w:fill="EEF3FA"/>
           </w:tcPr>
           <w:p>
@@ -1642,7 +1681,7 @@
               <w:rPr>
                 <w:sz w:val="19"/>
               </w:rPr>
-              <w:t>.../docs</w:t>
+              <w:t>Automated tests for every endpoint.</w:t>
             </w:r>
           </w:p>
         </w:tc>
@@ -1650,45 +1689,19 @@
     </w:tbl>
     <w:p>
       <w:pPr>
-        <w:spacing w:after="120"/>
+        <w:spacing w:after="40"/>
       </w:pPr>
-      <w:r>
-        <w:rPr>
-          <w:b w:val="0"/>
-          <w:i w:val="0"/>
-          <w:sz w:val="22"/>
-        </w:rPr>
-        <w:t>I originally set up the project for Render, but Render now asks for a credit card even on its free plan. To keep everything free and card-free, I deployed to Hugging Face Spaces using a small Dockerfile. Every time new code is pushed, Hugging Face rebuilds and redeploys the API automatically.</w:t>
-      </w:r>
     </w:p>
     <w:p>
       <w:pPr>
-        <w:spacing w:after="120"/>
-      </w:pPr>
-      <w:r>
-        <w:rPr>
-          <w:b w:val="0"/>
-          <w:i/>
-          <w:color w:val="555555"/>
-          <w:sz w:val="22"/>
-        </w:rPr>
-        <w:t>Note: on the free plan the Space sleeps after a long period of no traffic; the next visit wakes it up in about half a minute. This is normal for free hosting and does not affect the code.</w:t>
-      </w:r>
-    </w:p>
-    <w:p>
-      <w:r>
-        <w:br w:type="page"/>
-      </w:r>
-    </w:p>
-    <w:p>
-      <w:pPr>
-        <w:spacing w:before="280" w:after="120"/>
+        <w:keepNext/>
+        <w:spacing w:before="240" w:after="100"/>
       </w:pPr>
       <w:r>
         <w:rPr>
           <w:b/>
           <w:color w:val="1F3864"/>
-          <w:sz w:val="32"/>
+          <w:sz w:val="30"/>
         </w:rPr>
         <w:t>8. How to run it locally</w:t>
       </w:r>
@@ -1703,14 +1716,18 @@
           <w:i w:val="0"/>
           <w:sz w:val="22"/>
         </w:rPr>
-        <w:t>Any developer can run the project on their own machine with these steps (Python 3.10 or newer is required):</w:t>
+        <w:t>Python 3.10 or newer is required.</w:t>
       </w:r>
     </w:p>
     <w:p>
+      <w:pPr>
+        <w:spacing w:after="160"/>
+        <w:ind w:left="216"/>
+      </w:pPr>
       <w:r>
         <w:rPr>
           <w:rFonts w:ascii="Consolas" w:hAnsi="Consolas"/>
-          <w:sz w:val="20"/>
+          <w:sz w:val="19"/>
         </w:rPr>
         <w:t>python3 -m venv .venv</w:t>
         <w:br/>
@@ -1731,20 +1748,21 @@
           <w:i w:val="0"/>
           <w:sz w:val="22"/>
         </w:rPr>
-        <w:t>Then open http://127.0.0.1:8000/docs to try every endpoint in the browser. Run the automated tests with the command pytest.</w:t>
+        <w:t>Then open http://127.0.0.1:8000/docs. Run the tests with: pytest</w:t>
       </w:r>
     </w:p>
     <w:p>
       <w:pPr>
-        <w:spacing w:before="280" w:after="120"/>
+        <w:keepNext/>
+        <w:spacing w:before="240" w:after="100"/>
       </w:pPr>
       <w:r>
         <w:rPr>
           <w:b/>
           <w:color w:val="1F3864"/>
-          <w:sz w:val="32"/>
+          <w:sz w:val="30"/>
         </w:rPr>
-        <w:t>9. Testing</w:t>
+        <w:t>9. Deployment</w:t>
       </w:r>
     </w:p>
     <w:p>
@@ -1757,7 +1775,34 @@
           <w:i w:val="0"/>
           <w:sz w:val="22"/>
         </w:rPr>
-        <w:t>The repository includes a file called TESTING.md that gives four ready-made sample inputs for every route (covering high, medium, low and edge cases), so anyone can test the API quickly. For the alerts route, four sample students are already loaded in the mock ERP:</w:t>
+        <w:t>The code is on GitHub and the live API runs on Hugging Face Spaces (using a Dockerfile, free plan, no card required). Each time new code is pushed, Hugging Face rebuilds and redeploys automatically. On the free plan the Space sleeps after long inactivity and wakes up in about half a minute on the next request — normal for free hosting.</w:t>
+      </w:r>
+    </w:p>
+    <w:p>
+      <w:pPr>
+        <w:keepNext/>
+        <w:spacing w:before="240" w:after="100"/>
+      </w:pPr>
+      <w:r>
+        <w:rPr>
+          <w:b/>
+          <w:color w:val="1F3864"/>
+          <w:sz w:val="30"/>
+        </w:rPr>
+        <w:t>10. Testing</w:t>
+      </w:r>
+    </w:p>
+    <w:p>
+      <w:pPr>
+        <w:spacing w:after="120"/>
+      </w:pPr>
+      <w:r>
+        <w:rPr>
+          <w:b w:val="0"/>
+          <w:i w:val="0"/>
+          <w:sz w:val="22"/>
+        </w:rPr>
+        <w:t>The repository includes TESTING.md with four ready sample inputs for every route. Four sample students are already loaded for the alerts route:</w:t>
       </w:r>
     </w:p>
     <w:tbl>
@@ -1820,7 +1865,7 @@
                 <w:color w:val="FFFFFF"/>
                 <w:sz w:val="20"/>
               </w:rPr>
-              <w:t>What you'll see</w:t>
+              <w:t>What you see</w:t>
             </w:r>
           </w:p>
         </w:tc>
@@ -1864,7 +1909,7 @@
               <w:rPr>
                 <w:sz w:val="19"/>
               </w:rPr>
-              <w:t>Low-attendance alert</w:t>
+              <w:t>Fail + low-attendance alerts</w:t>
             </w:r>
           </w:p>
         </w:tc>
@@ -1911,7 +1956,7 @@
               <w:rPr>
                 <w:sz w:val="19"/>
               </w:rPr>
-              <w:t>No alerts (all good)</w:t>
+              <w:t>No alerts</w:t>
             </w:r>
           </w:p>
         </w:tc>
@@ -2010,367 +2055,8 @@
     </w:tbl>
     <w:p>
       <w:pPr>
-        <w:spacing w:before="280" w:after="120"/>
+        <w:spacing w:after="40"/>
       </w:pPr>
-      <w:r>
-        <w:rPr>
-          <w:b/>
-          <w:color w:val="1F3864"/>
-          <w:sz w:val="32"/>
-        </w:rPr>
-        <w:t>10. Technology used</w:t>
-      </w:r>
-    </w:p>
-    <w:p>
-      <w:pPr>
-        <w:pStyle w:val="ListBullet"/>
-      </w:pPr>
-      <w:r>
-        <w:rPr>
-          <w:b/>
-        </w:rPr>
-        <w:t>FastAPI</w:t>
-      </w:r>
-      <w:r>
-        <w:t xml:space="preserve"> — modern, fast Python web framework for building APIs.</w:t>
-      </w:r>
-    </w:p>
-    <w:p>
-      <w:pPr>
-        <w:pStyle w:val="ListBullet"/>
-      </w:pPr>
-      <w:r>
-        <w:rPr>
-          <w:b/>
-        </w:rPr>
-        <w:t>Pydantic</w:t>
-      </w:r>
-      <w:r>
-        <w:t xml:space="preserve"> — validates all incoming and outgoing data automatically.</w:t>
-      </w:r>
-    </w:p>
-    <w:p>
-      <w:pPr>
-        <w:pStyle w:val="ListBullet"/>
-      </w:pPr>
-      <w:r>
-        <w:rPr>
-          <w:b/>
-        </w:rPr>
-        <w:t>Uvicorn</w:t>
-      </w:r>
-      <w:r>
-        <w:t xml:space="preserve"> — the server that runs the application.</w:t>
-      </w:r>
-    </w:p>
-    <w:p>
-      <w:pPr>
-        <w:pStyle w:val="ListBullet"/>
-      </w:pPr>
-      <w:r>
-        <w:rPr>
-          <w:b/>
-        </w:rPr>
-        <w:t>HTTPX</w:t>
-      </w:r>
-      <w:r>
-        <w:t xml:space="preserve"> — used to call the real ERP over HTTP.</w:t>
-      </w:r>
-    </w:p>
-    <w:p>
-      <w:pPr>
-        <w:pStyle w:val="ListBullet"/>
-      </w:pPr>
-      <w:r>
-        <w:rPr>
-          <w:b/>
-        </w:rPr>
-        <w:t>Pytest</w:t>
-      </w:r>
-      <w:r>
-        <w:t xml:space="preserve"> — automated testing.</w:t>
-      </w:r>
-    </w:p>
-    <w:p>
-      <w:pPr>
-        <w:pStyle w:val="ListBullet"/>
-      </w:pPr>
-      <w:r>
-        <w:rPr>
-          <w:b/>
-        </w:rPr>
-        <w:t>Docker</w:t>
-      </w:r>
-      <w:r>
-        <w:t xml:space="preserve"> — packaging the app for free deployment on Hugging Face.</w:t>
-      </w:r>
-    </w:p>
-    <w:p>
-      <w:pPr>
-        <w:spacing w:before="280" w:after="120"/>
-      </w:pPr>
-      <w:r>
-        <w:rPr>
-          <w:b/>
-          <w:color w:val="1F3864"/>
-          <w:sz w:val="32"/>
-        </w:rPr>
-        <w:t>11. What can be added next</w:t>
-      </w:r>
-    </w:p>
-    <w:p>
-      <w:pPr>
-        <w:spacing w:after="120"/>
-      </w:pPr>
-      <w:r>
-        <w:rPr>
-          <w:b w:val="0"/>
-          <w:i w:val="0"/>
-          <w:sz w:val="22"/>
-        </w:rPr>
-        <w:t>The module is complete for its scope, and it is built so the following can be added without disturbing the rest of the code:</w:t>
-      </w:r>
-    </w:p>
-    <w:p>
-      <w:pPr>
-        <w:pStyle w:val="ListBullet"/>
-      </w:pPr>
-      <w:r>
-        <w:rPr>
-          <w:b/>
-        </w:rPr>
-        <w:t>Real ML model</w:t>
-      </w:r>
-      <w:r>
-        <w:t xml:space="preserve"> — replace the rule-based placeholder in app/models/predictor.py with the trained model. The rest of the app stays the same.</w:t>
-      </w:r>
-    </w:p>
-    <w:p>
-      <w:pPr>
-        <w:pStyle w:val="ListBullet"/>
-      </w:pPr>
-      <w:r>
-        <w:rPr>
-          <w:b/>
-        </w:rPr>
-        <w:t>Real ERP connection</w:t>
-      </w:r>
-      <w:r>
-        <w:t xml:space="preserve"> — flip ERP_MOCK_MODE to false and add the credentials.</w:t>
-      </w:r>
-    </w:p>
-    <w:p>
-      <w:pPr>
-        <w:pStyle w:val="ListBullet"/>
-      </w:pPr>
-      <w:r>
-        <w:rPr>
-          <w:b/>
-        </w:rPr>
-        <w:t>A database</w:t>
-      </w:r>
-      <w:r>
-        <w:t xml:space="preserve"> — if the institute wants to store every prediction, a free hosted database (such as Neon or Supabase) can be connected.</w:t>
-      </w:r>
-    </w:p>
-    <w:p>
-      <w:pPr>
-        <w:spacing w:before="280" w:after="120"/>
-      </w:pPr>
-      <w:r>
-        <w:rPr>
-          <w:b/>
-          <w:color w:val="1F3864"/>
-          <w:sz w:val="32"/>
-        </w:rPr>
-        <w:t>12. Quick links</w:t>
-      </w:r>
-    </w:p>
-    <w:tbl>
-      <w:tblPr>
-        <w:tblStyle w:val="TableGrid"/>
-        <w:tblW w:type="auto" w:w="0"/>
-        <w:jc w:val="center"/>
-        <w:tblLook w:firstColumn="1" w:firstRow="1" w:lastColumn="0" w:lastRow="0" w:noHBand="0" w:noVBand="1" w:val="04A0"/>
-      </w:tblPr>
-      <w:tblGrid>
-        <w:gridCol w:w="4320"/>
-        <w:gridCol w:w="4320"/>
-      </w:tblGrid>
-      <w:tr>
-        <w:tc>
-          <w:tcPr>
-            <w:tcW w:type="dxa" w:w="3744"/>
-            <w:shd w:val="clear" w:color="auto" w:fill="2E75B6"/>
-          </w:tcPr>
-          <w:p>
-            <w:r/>
-            <w:r>
-              <w:rPr>
-                <w:b/>
-                <w:color w:val="FFFFFF"/>
-                <w:sz w:val="20"/>
-              </w:rPr>
-              <w:t>Resource</w:t>
-            </w:r>
-          </w:p>
-        </w:tc>
-        <w:tc>
-          <w:tcPr>
-            <w:tcW w:type="dxa" w:w="9216"/>
-            <w:shd w:val="clear" w:color="auto" w:fill="2E75B6"/>
-          </w:tcPr>
-          <w:p>
-            <w:r/>
-            <w:r>
-              <w:rPr>
-                <w:b/>
-                <w:color w:val="FFFFFF"/>
-                <w:sz w:val="20"/>
-              </w:rPr>
-              <w:t>URL</w:t>
-            </w:r>
-          </w:p>
-        </w:tc>
-      </w:tr>
-      <w:tr>
-        <w:tc>
-          <w:tcPr>
-            <w:tcW w:type="dxa" w:w="3744"/>
-          </w:tcPr>
-          <w:p>
-            <w:r/>
-            <w:r>
-              <w:rPr>
-                <w:sz w:val="19"/>
-              </w:rPr>
-              <w:t>Source code (GitHub)</w:t>
-            </w:r>
-          </w:p>
-        </w:tc>
-        <w:tc>
-          <w:tcPr>
-            <w:tcW w:type="dxa" w:w="9216"/>
-          </w:tcPr>
-          <w:p>
-            <w:r/>
-            <w:r>
-              <w:rPr>
-                <w:sz w:val="19"/>
-              </w:rPr>
-              <w:t>https://github.com/muhammadabdullah901/early-warning-api</w:t>
-            </w:r>
-          </w:p>
-        </w:tc>
-      </w:tr>
-      <w:tr>
-        <w:tc>
-          <w:tcPr>
-            <w:tcW w:type="dxa" w:w="3744"/>
-            <w:shd w:val="clear" w:color="auto" w:fill="EEF3FA"/>
-          </w:tcPr>
-          <w:p>
-            <w:r/>
-            <w:r>
-              <w:rPr>
-                <w:sz w:val="19"/>
-              </w:rPr>
-              <w:t>Live interactive docs</w:t>
-            </w:r>
-          </w:p>
-        </w:tc>
-        <w:tc>
-          <w:tcPr>
-            <w:tcW w:type="dxa" w:w="9216"/>
-            <w:shd w:val="clear" w:color="auto" w:fill="EEF3FA"/>
-          </w:tcPr>
-          <w:p>
-            <w:r/>
-            <w:r>
-              <w:rPr>
-                <w:sz w:val="19"/>
-              </w:rPr>
-              <w:t>https://muhammadabdullah31808-early-warning-api.hf.space/docs</w:t>
-            </w:r>
-          </w:p>
-        </w:tc>
-      </w:tr>
-      <w:tr>
-        <w:tc>
-          <w:tcPr>
-            <w:tcW w:type="dxa" w:w="3744"/>
-          </w:tcPr>
-          <w:p>
-            <w:r/>
-            <w:r>
-              <w:rPr>
-                <w:sz w:val="19"/>
-              </w:rPr>
-              <w:t>Live API base URL</w:t>
-            </w:r>
-          </w:p>
-        </w:tc>
-        <w:tc>
-          <w:tcPr>
-            <w:tcW w:type="dxa" w:w="9216"/>
-          </w:tcPr>
-          <w:p>
-            <w:r/>
-            <w:r>
-              <w:rPr>
-                <w:sz w:val="19"/>
-              </w:rPr>
-              <w:t>https://muhammadabdullah31808-early-warning-api.hf.space</w:t>
-            </w:r>
-          </w:p>
-        </w:tc>
-      </w:tr>
-      <w:tr>
-        <w:tc>
-          <w:tcPr>
-            <w:tcW w:type="dxa" w:w="3744"/>
-            <w:shd w:val="clear" w:color="auto" w:fill="EEF3FA"/>
-          </w:tcPr>
-          <w:p>
-            <w:r/>
-            <w:r>
-              <w:rPr>
-                <w:sz w:val="19"/>
-              </w:rPr>
-              <w:t>Hugging Face Space</w:t>
-            </w:r>
-          </w:p>
-        </w:tc>
-        <w:tc>
-          <w:tcPr>
-            <w:tcW w:type="dxa" w:w="9216"/>
-            <w:shd w:val="clear" w:color="auto" w:fill="EEF3FA"/>
-          </w:tcPr>
-          <w:p>
-            <w:r/>
-            <w:r>
-              <w:rPr>
-                <w:sz w:val="19"/>
-              </w:rPr>
-              <w:t>https://huggingface.co/spaces/muhammadabdullah31808/early-warning-api</w:t>
-            </w:r>
-          </w:p>
-        </w:tc>
-      </w:tr>
-    </w:tbl>
-    <w:p/>
-    <w:p>
-      <w:pPr>
-        <w:jc w:val="center"/>
-      </w:pPr>
-      <w:r>
-        <w:rPr>
-          <w:i/>
-          <w:color w:val="555555"/>
-          <w:sz w:val="20"/>
-        </w:rPr>
-        <w:t>— End of document —</w:t>
-      </w:r>
     </w:p>
     <w:sectPr>
       <w:pgSz w:w="12240" w:h="15840"/>
@@ -2745,6 +2431,9 @@
     <w:name w:val="Normal"/>
     <w:qFormat/>
     <w:rsid w:val="00FC693F"/>
+    <w:pPr>
+      <w:spacing w:before="0" w:after="120" w:line="276" w:lineRule="auto"/>
+    </w:pPr>
     <w:rPr>
       <w:rFonts w:ascii="Calibri" w:hAnsi="Calibri"/>
       <w:sz w:val="22"/>

</xml_diff>